<commit_message>
Shortened version is ready for review by scientific supervisor
</commit_message>
<xml_diff>
--- a/Article.docx
+++ b/Article.docx
@@ -549,11 +549,19 @@
         </w:rPr>
         <w:t xml:space="preserve">, </w:t>
       </w:r>
-      <w:r>
-        <w:rPr>
-          <w:lang w:val="ru-RU"/>
-        </w:rPr>
-        <w:t>« »)</w:t>
+      <w:proofErr w:type="gramStart"/>
+      <w:r>
+        <w:rPr>
+          <w:lang w:val="ru-RU"/>
+        </w:rPr>
+        <w:t>« »</w:t>
+      </w:r>
+      <w:proofErr w:type="gramEnd"/>
+      <w:r>
+        <w:rPr>
+          <w:lang w:val="ru-RU"/>
+        </w:rPr>
+        <w:t>)</w:t>
       </w:r>
       <w:r>
         <w:rPr>
@@ -788,7 +796,23 @@
           <w:sz w:val="22"/>
           <w:szCs w:val="22"/>
         </w:rPr>
-        <w:t xml:space="preserve">    uint8_t len;</w:t>
+        <w:t xml:space="preserve">    uint8_t </w:t>
+      </w:r>
+      <w:proofErr w:type="spellStart"/>
+      <w:r>
+        <w:rPr>
+          <w:sz w:val="22"/>
+          <w:szCs w:val="22"/>
+        </w:rPr>
+        <w:t>len</w:t>
+      </w:r>
+      <w:proofErr w:type="spellEnd"/>
+      <w:r>
+        <w:rPr>
+          <w:sz w:val="22"/>
+          <w:szCs w:val="22"/>
+        </w:rPr>
+        <w:t>;</w:t>
       </w:r>
     </w:p>
     <w:p>
@@ -804,7 +828,23 @@
           <w:sz w:val="22"/>
           <w:szCs w:val="22"/>
         </w:rPr>
-        <w:t xml:space="preserve">    char sig[4];</w:t>
+        <w:t xml:space="preserve">    char </w:t>
+      </w:r>
+      <w:proofErr w:type="gramStart"/>
+      <w:r>
+        <w:rPr>
+          <w:sz w:val="22"/>
+          <w:szCs w:val="22"/>
+        </w:rPr>
+        <w:t>sig[</w:t>
+      </w:r>
+      <w:proofErr w:type="gramEnd"/>
+      <w:r>
+        <w:rPr>
+          <w:sz w:val="22"/>
+          <w:szCs w:val="22"/>
+        </w:rPr>
+        <w:t>4];</w:t>
       </w:r>
     </w:p>
     <w:p>
@@ -820,7 +860,23 @@
           <w:sz w:val="22"/>
           <w:szCs w:val="22"/>
         </w:rPr>
-        <w:t xml:space="preserve">    void (*handler)(Interpreter*);</w:t>
+        <w:t xml:space="preserve">    void (*</w:t>
+      </w:r>
+      <w:proofErr w:type="gramStart"/>
+      <w:r>
+        <w:rPr>
+          <w:sz w:val="22"/>
+          <w:szCs w:val="22"/>
+        </w:rPr>
+        <w:t>handler)(</w:t>
+      </w:r>
+      <w:proofErr w:type="gramEnd"/>
+      <w:r>
+        <w:rPr>
+          <w:sz w:val="22"/>
+          <w:szCs w:val="22"/>
+        </w:rPr>
+        <w:t>Interpreter*);</w:t>
       </w:r>
     </w:p>
     <w:p>
@@ -836,7 +892,23 @@
           <w:sz w:val="22"/>
           <w:szCs w:val="22"/>
         </w:rPr>
-        <w:t xml:space="preserve">    bool has_param;</w:t>
+        <w:t xml:space="preserve">    bool </w:t>
+      </w:r>
+      <w:proofErr w:type="spellStart"/>
+      <w:r>
+        <w:rPr>
+          <w:sz w:val="22"/>
+          <w:szCs w:val="22"/>
+        </w:rPr>
+        <w:t>has_param</w:t>
+      </w:r>
+      <w:proofErr w:type="spellEnd"/>
+      <w:r>
+        <w:rPr>
+          <w:sz w:val="22"/>
+          <w:szCs w:val="22"/>
+        </w:rPr>
+        <w:t>;</w:t>
       </w:r>
     </w:p>
     <w:p>
@@ -877,7 +949,39 @@
           <w:sz w:val="22"/>
           <w:szCs w:val="22"/>
         </w:rPr>
-        <w:t>static const Instruction instruction_table[] = {</w:t>
+        <w:t xml:space="preserve">static const Instruction </w:t>
+      </w:r>
+      <w:proofErr w:type="spellStart"/>
+      <w:r>
+        <w:rPr>
+          <w:sz w:val="22"/>
+          <w:szCs w:val="22"/>
+        </w:rPr>
+        <w:t>instruction_</w:t>
+      </w:r>
+      <w:proofErr w:type="gramStart"/>
+      <w:r>
+        <w:rPr>
+          <w:sz w:val="22"/>
+          <w:szCs w:val="22"/>
+        </w:rPr>
+        <w:t>table</w:t>
+      </w:r>
+      <w:proofErr w:type="spellEnd"/>
+      <w:r>
+        <w:rPr>
+          <w:sz w:val="22"/>
+          <w:szCs w:val="22"/>
+        </w:rPr>
+        <w:t>[</w:t>
+      </w:r>
+      <w:proofErr w:type="gramEnd"/>
+      <w:r>
+        <w:rPr>
+          <w:sz w:val="22"/>
+          <w:szCs w:val="22"/>
+        </w:rPr>
+        <w:t>] = {</w:t>
       </w:r>
     </w:p>
     <w:p>
@@ -893,7 +997,23 @@
           <w:sz w:val="22"/>
           <w:szCs w:val="22"/>
         </w:rPr>
-        <w:t xml:space="preserve">    {2, {SPACE, SPACE}, instr_push, true},</w:t>
+        <w:t xml:space="preserve">    {2, {SPACE, SPACE}, </w:t>
+      </w:r>
+      <w:proofErr w:type="spellStart"/>
+      <w:r>
+        <w:rPr>
+          <w:sz w:val="22"/>
+          <w:szCs w:val="22"/>
+        </w:rPr>
+        <w:t>instr_push</w:t>
+      </w:r>
+      <w:proofErr w:type="spellEnd"/>
+      <w:r>
+        <w:rPr>
+          <w:sz w:val="22"/>
+          <w:szCs w:val="22"/>
+        </w:rPr>
+        <w:t>, true},</w:t>
       </w:r>
     </w:p>
     <w:p>
@@ -925,7 +1045,23 @@
           <w:sz w:val="22"/>
           <w:szCs w:val="22"/>
         </w:rPr>
-        <w:t xml:space="preserve">    {3, {LINEFEED, LINEFEED, LINEFEED}, instr_end, false}</w:t>
+        <w:t xml:space="preserve">    {3, {LINEFEED, LINEFEED, LINEFEED}, </w:t>
+      </w:r>
+      <w:proofErr w:type="spellStart"/>
+      <w:r>
+        <w:rPr>
+          <w:sz w:val="22"/>
+          <w:szCs w:val="22"/>
+        </w:rPr>
+        <w:t>instr_end</w:t>
+      </w:r>
+      <w:proofErr w:type="spellEnd"/>
+      <w:r>
+        <w:rPr>
+          <w:sz w:val="22"/>
+          <w:szCs w:val="22"/>
+        </w:rPr>
+        <w:t>, false}</w:t>
       </w:r>
     </w:p>
     <w:p>
@@ -966,7 +1102,39 @@
           <w:sz w:val="22"/>
           <w:szCs w:val="22"/>
         </w:rPr>
-        <w:t>bool exec_instruction(Interpreter *it) {</w:t>
+        <w:t xml:space="preserve">bool </w:t>
+      </w:r>
+      <w:proofErr w:type="spellStart"/>
+      <w:r>
+        <w:rPr>
+          <w:sz w:val="22"/>
+          <w:szCs w:val="22"/>
+        </w:rPr>
+        <w:t>exec_</w:t>
+      </w:r>
+      <w:proofErr w:type="gramStart"/>
+      <w:r>
+        <w:rPr>
+          <w:sz w:val="22"/>
+          <w:szCs w:val="22"/>
+        </w:rPr>
+        <w:t>instruction</w:t>
+      </w:r>
+      <w:proofErr w:type="spellEnd"/>
+      <w:r>
+        <w:rPr>
+          <w:sz w:val="22"/>
+          <w:szCs w:val="22"/>
+        </w:rPr>
+        <w:t>(</w:t>
+      </w:r>
+      <w:proofErr w:type="gramEnd"/>
+      <w:r>
+        <w:rPr>
+          <w:sz w:val="22"/>
+          <w:szCs w:val="22"/>
+        </w:rPr>
+        <w:t>Interpreter *it) {</w:t>
       </w:r>
     </w:p>
     <w:p>
@@ -982,7 +1150,23 @@
           <w:sz w:val="22"/>
           <w:szCs w:val="22"/>
         </w:rPr>
-        <w:t xml:space="preserve">    ParserState *p = &amp;it-&gt;parser;</w:t>
+        <w:t xml:space="preserve">    </w:t>
+      </w:r>
+      <w:proofErr w:type="spellStart"/>
+      <w:r>
+        <w:rPr>
+          <w:sz w:val="22"/>
+          <w:szCs w:val="22"/>
+        </w:rPr>
+        <w:t>ParserState</w:t>
+      </w:r>
+      <w:proofErr w:type="spellEnd"/>
+      <w:r>
+        <w:rPr>
+          <w:sz w:val="22"/>
+          <w:szCs w:val="22"/>
+        </w:rPr>
+        <w:t xml:space="preserve"> *p = &amp;it-&gt;parser;</w:t>
       </w:r>
     </w:p>
     <w:p>
@@ -998,7 +1182,23 @@
           <w:sz w:val="22"/>
           <w:szCs w:val="22"/>
         </w:rPr>
-        <w:t xml:space="preserve">    char first = parse_next_char(p);</w:t>
+        <w:t xml:space="preserve">    char first = </w:t>
+      </w:r>
+      <w:proofErr w:type="spellStart"/>
+      <w:r>
+        <w:rPr>
+          <w:sz w:val="22"/>
+          <w:szCs w:val="22"/>
+        </w:rPr>
+        <w:t>parse_next_char</w:t>
+      </w:r>
+      <w:proofErr w:type="spellEnd"/>
+      <w:r>
+        <w:rPr>
+          <w:sz w:val="22"/>
+          <w:szCs w:val="22"/>
+        </w:rPr>
+        <w:t>(p);</w:t>
       </w:r>
     </w:p>
     <w:p>
@@ -1030,7 +1230,71 @@
           <w:sz w:val="22"/>
           <w:szCs w:val="22"/>
         </w:rPr>
-        <w:t xml:space="preserve">    for (size_t i = 0; i &lt; INSTR_COUNT; i++) {</w:t>
+        <w:t xml:space="preserve">    for (</w:t>
+      </w:r>
+      <w:proofErr w:type="spellStart"/>
+      <w:r>
+        <w:rPr>
+          <w:sz w:val="22"/>
+          <w:szCs w:val="22"/>
+        </w:rPr>
+        <w:t>size_t</w:t>
+      </w:r>
+      <w:proofErr w:type="spellEnd"/>
+      <w:r>
+        <w:rPr>
+          <w:sz w:val="22"/>
+          <w:szCs w:val="22"/>
+        </w:rPr>
+        <w:t xml:space="preserve"> </w:t>
+      </w:r>
+      <w:proofErr w:type="spellStart"/>
+      <w:r>
+        <w:rPr>
+          <w:sz w:val="22"/>
+          <w:szCs w:val="22"/>
+        </w:rPr>
+        <w:t>i</w:t>
+      </w:r>
+      <w:proofErr w:type="spellEnd"/>
+      <w:r>
+        <w:rPr>
+          <w:sz w:val="22"/>
+          <w:szCs w:val="22"/>
+        </w:rPr>
+        <w:t xml:space="preserve"> = 0; </w:t>
+      </w:r>
+      <w:proofErr w:type="spellStart"/>
+      <w:r>
+        <w:rPr>
+          <w:sz w:val="22"/>
+          <w:szCs w:val="22"/>
+        </w:rPr>
+        <w:t>i</w:t>
+      </w:r>
+      <w:proofErr w:type="spellEnd"/>
+      <w:r>
+        <w:rPr>
+          <w:sz w:val="22"/>
+          <w:szCs w:val="22"/>
+        </w:rPr>
+        <w:t xml:space="preserve"> &lt; INSTR_COUNT; </w:t>
+      </w:r>
+      <w:proofErr w:type="spellStart"/>
+      <w:r>
+        <w:rPr>
+          <w:sz w:val="22"/>
+          <w:szCs w:val="22"/>
+        </w:rPr>
+        <w:t>i</w:t>
+      </w:r>
+      <w:proofErr w:type="spellEnd"/>
+      <w:r>
+        <w:rPr>
+          <w:sz w:val="22"/>
+          <w:szCs w:val="22"/>
+        </w:rPr>
+        <w:t>++) {</w:t>
       </w:r>
     </w:p>
     <w:p>
@@ -1046,7 +1310,39 @@
           <w:sz w:val="22"/>
           <w:szCs w:val="22"/>
         </w:rPr>
-        <w:t xml:space="preserve">        const Instruction *ins = &amp;instruction_table[i];</w:t>
+        <w:t xml:space="preserve">        const Instruction *ins = &amp;</w:t>
+      </w:r>
+      <w:proofErr w:type="spellStart"/>
+      <w:r>
+        <w:rPr>
+          <w:sz w:val="22"/>
+          <w:szCs w:val="22"/>
+        </w:rPr>
+        <w:t>instruction_table</w:t>
+      </w:r>
+      <w:proofErr w:type="spellEnd"/>
+      <w:r>
+        <w:rPr>
+          <w:sz w:val="22"/>
+          <w:szCs w:val="22"/>
+        </w:rPr>
+        <w:t>[</w:t>
+      </w:r>
+      <w:proofErr w:type="spellStart"/>
+      <w:r>
+        <w:rPr>
+          <w:sz w:val="22"/>
+          <w:szCs w:val="22"/>
+        </w:rPr>
+        <w:t>i</w:t>
+      </w:r>
+      <w:proofErr w:type="spellEnd"/>
+      <w:r>
+        <w:rPr>
+          <w:sz w:val="22"/>
+          <w:szCs w:val="22"/>
+        </w:rPr>
+        <w:t>];</w:t>
       </w:r>
     </w:p>
     <w:p>
@@ -1062,7 +1358,39 @@
           <w:sz w:val="22"/>
           <w:szCs w:val="22"/>
         </w:rPr>
-        <w:t xml:space="preserve">        if (ins-&gt;sig[0] != first) continue;</w:t>
+        <w:t xml:space="preserve">        if (ins-&gt;</w:t>
+      </w:r>
+      <w:proofErr w:type="gramStart"/>
+      <w:r>
+        <w:rPr>
+          <w:sz w:val="22"/>
+          <w:szCs w:val="22"/>
+        </w:rPr>
+        <w:t>sig[</w:t>
+      </w:r>
+      <w:proofErr w:type="gramEnd"/>
+      <w:r>
+        <w:rPr>
+          <w:sz w:val="22"/>
+          <w:szCs w:val="22"/>
+        </w:rPr>
+        <w:t>0</w:t>
+      </w:r>
+      <w:proofErr w:type="gramStart"/>
+      <w:r>
+        <w:rPr>
+          <w:sz w:val="22"/>
+          <w:szCs w:val="22"/>
+        </w:rPr>
+        <w:t>] !</w:t>
+      </w:r>
+      <w:proofErr w:type="gramEnd"/>
+      <w:r>
+        <w:rPr>
+          <w:sz w:val="22"/>
+          <w:szCs w:val="22"/>
+        </w:rPr>
+        <w:t>= first) continue;</w:t>
       </w:r>
     </w:p>
     <w:p>
@@ -1094,7 +1422,39 @@
           <w:sz w:val="22"/>
           <w:szCs w:val="22"/>
         </w:rPr>
-        <w:t xml:space="preserve">        for (int j = 1; j &lt; ins-&gt;len; j++) {</w:t>
+        <w:t xml:space="preserve">        for (int j = 1; j &lt; ins-&gt;</w:t>
+      </w:r>
+      <w:proofErr w:type="spellStart"/>
+      <w:r>
+        <w:rPr>
+          <w:sz w:val="22"/>
+          <w:szCs w:val="22"/>
+        </w:rPr>
+        <w:t>len</w:t>
+      </w:r>
+      <w:proofErr w:type="spellEnd"/>
+      <w:r>
+        <w:rPr>
+          <w:sz w:val="22"/>
+          <w:szCs w:val="22"/>
+        </w:rPr>
+        <w:t xml:space="preserve">; </w:t>
+      </w:r>
+      <w:proofErr w:type="spellStart"/>
+      <w:r>
+        <w:rPr>
+          <w:sz w:val="22"/>
+          <w:szCs w:val="22"/>
+        </w:rPr>
+        <w:t>j++</w:t>
+      </w:r>
+      <w:proofErr w:type="spellEnd"/>
+      <w:r>
+        <w:rPr>
+          <w:sz w:val="22"/>
+          <w:szCs w:val="22"/>
+        </w:rPr>
+        <w:t>) {</w:t>
       </w:r>
     </w:p>
     <w:p>
@@ -1110,7 +1470,39 @@
           <w:sz w:val="22"/>
           <w:szCs w:val="22"/>
         </w:rPr>
-        <w:t xml:space="preserve">            if (parse_next_char(p) != ins-&gt;sig[j]) {</w:t>
+        <w:t xml:space="preserve">            if (</w:t>
+      </w:r>
+      <w:proofErr w:type="spellStart"/>
+      <w:r>
+        <w:rPr>
+          <w:sz w:val="22"/>
+          <w:szCs w:val="22"/>
+        </w:rPr>
+        <w:t>parse_next_char</w:t>
+      </w:r>
+      <w:proofErr w:type="spellEnd"/>
+      <w:r>
+        <w:rPr>
+          <w:sz w:val="22"/>
+          <w:szCs w:val="22"/>
+        </w:rPr>
+        <w:t>(p</w:t>
+      </w:r>
+      <w:proofErr w:type="gramStart"/>
+      <w:r>
+        <w:rPr>
+          <w:sz w:val="22"/>
+          <w:szCs w:val="22"/>
+        </w:rPr>
+        <w:t>) !</w:t>
+      </w:r>
+      <w:proofErr w:type="gramEnd"/>
+      <w:r>
+        <w:rPr>
+          <w:sz w:val="22"/>
+          <w:szCs w:val="22"/>
+        </w:rPr>
+        <w:t>= ins-&gt;sig[j]) {</w:t>
       </w:r>
     </w:p>
     <w:p>
@@ -1815,8 +2207,16 @@
         <w:rPr>
           <w:lang w:val="ru-RU"/>
         </w:rPr>
-        <w:t xml:space="preserve"> коделями</w:t>
-      </w:r>
+        <w:t xml:space="preserve"> </w:t>
+      </w:r>
+      <w:proofErr w:type="spellStart"/>
+      <w:r>
+        <w:rPr>
+          <w:lang w:val="ru-RU"/>
+        </w:rPr>
+        <w:t>коделями</w:t>
+      </w:r>
+      <w:proofErr w:type="spellEnd"/>
       <w:r>
         <w:rPr>
           <w:lang w:val="ru-RU"/>
@@ -2550,8 +2950,13 @@
         </w:rPr>
         <w:tab/>
       </w:r>
-      <w:r>
-        <w:t xml:space="preserve">Cmd – </w:t>
+      <w:proofErr w:type="spellStart"/>
+      <w:r>
+        <w:t>Cmd</w:t>
+      </w:r>
+      <w:proofErr w:type="spellEnd"/>
+      <w:r>
+        <w:t xml:space="preserve"> – </w:t>
       </w:r>
       <w:r>
         <w:rPr>
@@ -2642,6 +3047,7 @@
         </w:rPr>
         <w:tab/>
       </w:r>
+      <w:proofErr w:type="spellStart"/>
       <w:r>
         <w:t>H</w:t>
       </w:r>
@@ -2651,6 +3057,7 @@
         </w:rPr>
         <w:t>n</w:t>
       </w:r>
+      <w:proofErr w:type="spellEnd"/>
       <w:r>
         <w:rPr>
           <w:lang w:val="ru-RU"/>
@@ -3016,15 +3423,18 @@
         </w:rPr>
         <w:t xml:space="preserve"> </w:t>
       </w:r>
+      <w:proofErr w:type="spellStart"/>
       <w:r>
         <w:t>piet</w:t>
       </w:r>
+      <w:proofErr w:type="spellEnd"/>
       <w:r>
         <w:rPr>
           <w:lang w:val="ru-RU"/>
         </w:rPr>
         <w:t>_</w:t>
       </w:r>
+      <w:proofErr w:type="gramStart"/>
       <w:r>
         <w:t>action</w:t>
       </w:r>
@@ -3034,6 +3444,7 @@
         </w:rPr>
         <w:t>(</w:t>
       </w:r>
+      <w:proofErr w:type="gramEnd"/>
       <w:r>
         <w:t>int</w:t>
       </w:r>
@@ -3146,7 +3557,31 @@
         <w:t xml:space="preserve">    </w:t>
       </w:r>
       <w:r>
-        <w:t xml:space="preserve">int hue_change = ((piet_get_hue(a_col) - </w:t>
+        <w:t xml:space="preserve">int </w:t>
+      </w:r>
+      <w:proofErr w:type="spellStart"/>
+      <w:r>
+        <w:t>hue_change</w:t>
+      </w:r>
+      <w:proofErr w:type="spellEnd"/>
+      <w:r>
+        <w:t xml:space="preserve"> = ((</w:t>
+      </w:r>
+      <w:proofErr w:type="spellStart"/>
+      <w:r>
+        <w:t>piet_get_hue</w:t>
+      </w:r>
+      <w:proofErr w:type="spellEnd"/>
+      <w:r>
+        <w:t>(</w:t>
+      </w:r>
+      <w:proofErr w:type="spellStart"/>
+      <w:r>
+        <w:t>a_col</w:t>
+      </w:r>
+      <w:proofErr w:type="spellEnd"/>
+      <w:r>
+        <w:t xml:space="preserve">) - </w:t>
       </w:r>
       <w:r>
         <w:tab/>
@@ -3157,8 +3592,21 @@
         <w:pStyle w:val="ae"/>
         <w:ind w:left="708"/>
       </w:pPr>
-      <w:r>
-        <w:t>piet_get_hue(c_col)) + N_HUE) % N_HUE;</w:t>
+      <w:proofErr w:type="spellStart"/>
+      <w:r>
+        <w:t>piet_get_hue</w:t>
+      </w:r>
+      <w:proofErr w:type="spellEnd"/>
+      <w:r>
+        <w:t>(</w:t>
+      </w:r>
+      <w:proofErr w:type="spellStart"/>
+      <w:r>
+        <w:t>c_col</w:t>
+      </w:r>
+      <w:proofErr w:type="spellEnd"/>
+      <w:r>
+        <w:t>)) + N_HUE) % N_HUE;</w:t>
       </w:r>
     </w:p>
     <w:p>
@@ -3170,7 +3618,31 @@
         <w:t xml:space="preserve">    </w:t>
       </w:r>
       <w:r>
-        <w:t xml:space="preserve">int light_change = ((piet_get_light(a_col) </w:t>
+        <w:t xml:space="preserve">int </w:t>
+      </w:r>
+      <w:proofErr w:type="spellStart"/>
+      <w:r>
+        <w:t>light_change</w:t>
+      </w:r>
+      <w:proofErr w:type="spellEnd"/>
+      <w:r>
+        <w:t xml:space="preserve"> = ((</w:t>
+      </w:r>
+      <w:proofErr w:type="spellStart"/>
+      <w:r>
+        <w:t>piet_get_light</w:t>
+      </w:r>
+      <w:proofErr w:type="spellEnd"/>
+      <w:r>
+        <w:t>(</w:t>
+      </w:r>
+      <w:proofErr w:type="spellStart"/>
+      <w:r>
+        <w:t>a_col</w:t>
+      </w:r>
+      <w:proofErr w:type="spellEnd"/>
+      <w:r>
+        <w:t xml:space="preserve">) </w:t>
       </w:r>
       <w:r>
         <w:t>–</w:t>
@@ -3181,8 +3653,21 @@
         <w:pStyle w:val="ae"/>
         <w:ind w:left="708"/>
       </w:pPr>
-      <w:r>
-        <w:t>piet_get_light(c_col)) + N_LIGHT) % N_LIGHT;</w:t>
+      <w:proofErr w:type="spellStart"/>
+      <w:r>
+        <w:t>piet_get_light</w:t>
+      </w:r>
+      <w:proofErr w:type="spellEnd"/>
+      <w:r>
+        <w:t>(</w:t>
+      </w:r>
+      <w:proofErr w:type="spellStart"/>
+      <w:r>
+        <w:t>c_col</w:t>
+      </w:r>
+      <w:proofErr w:type="spellEnd"/>
+      <w:r>
+        <w:t>)) + N_LIGHT) % N_LIGHT;</w:t>
       </w:r>
     </w:p>
     <w:p>
@@ -3191,7 +3676,39 @@
         <w:ind w:firstLine="0"/>
       </w:pPr>
       <w:r>
-        <w:t xml:space="preserve">    piet_cell_to_str(c_col), piet_cell_to_str(a_col),</w:t>
+        <w:t xml:space="preserve">    </w:t>
+      </w:r>
+      <w:proofErr w:type="spellStart"/>
+      <w:r>
+        <w:t>piet_cell_to_str</w:t>
+      </w:r>
+      <w:proofErr w:type="spellEnd"/>
+      <w:r>
+        <w:t>(</w:t>
+      </w:r>
+      <w:proofErr w:type="spellStart"/>
+      <w:r>
+        <w:t>c_col</w:t>
+      </w:r>
+      <w:proofErr w:type="spellEnd"/>
+      <w:r>
+        <w:t xml:space="preserve">), </w:t>
+      </w:r>
+      <w:proofErr w:type="spellStart"/>
+      <w:r>
+        <w:t>piet_cell_to_str</w:t>
+      </w:r>
+      <w:proofErr w:type="spellEnd"/>
+      <w:r>
+        <w:t>(</w:t>
+      </w:r>
+      <w:proofErr w:type="spellStart"/>
+      <w:r>
+        <w:t>a_col</w:t>
+      </w:r>
+      <w:proofErr w:type="spellEnd"/>
+      <w:r>
+        <w:t>),</w:t>
       </w:r>
     </w:p>
     <w:p>
@@ -3200,7 +3717,23 @@
         <w:ind w:firstLine="0"/>
       </w:pPr>
       <w:r>
-        <w:t xml:space="preserve">          hue_change, light_change);</w:t>
+        <w:t xml:space="preserve">          </w:t>
+      </w:r>
+      <w:proofErr w:type="spellStart"/>
+      <w:r>
+        <w:t>hue_change</w:t>
+      </w:r>
+      <w:proofErr w:type="spellEnd"/>
+      <w:r>
+        <w:t xml:space="preserve">, </w:t>
+      </w:r>
+      <w:proofErr w:type="spellStart"/>
+      <w:r>
+        <w:t>light_change</w:t>
+      </w:r>
+      <w:proofErr w:type="spellEnd"/>
+      <w:r>
+        <w:t>);</w:t>
       </w:r>
     </w:p>
     <w:p>
@@ -3209,7 +3742,15 @@
         <w:ind w:firstLine="0"/>
       </w:pPr>
       <w:r>
-        <w:t xml:space="preserve">    switch (hue_change) {</w:t>
+        <w:t xml:space="preserve">    switch (</w:t>
+      </w:r>
+      <w:proofErr w:type="spellStart"/>
+      <w:r>
+        <w:t>hue_change</w:t>
+      </w:r>
+      <w:proofErr w:type="spellEnd"/>
+      <w:r>
+        <w:t>) {</w:t>
       </w:r>
     </w:p>
     <w:p>
@@ -3227,7 +3768,15 @@
         <w:ind w:firstLine="0"/>
       </w:pPr>
       <w:r>
-        <w:t xml:space="preserve">            if (light_change == 1) {</w:t>
+        <w:t xml:space="preserve">            if (</w:t>
+      </w:r>
+      <w:proofErr w:type="spellStart"/>
+      <w:r>
+        <w:t>light_change</w:t>
+      </w:r>
+      <w:proofErr w:type="spellEnd"/>
+      <w:r>
+        <w:t xml:space="preserve"> == 1) {</w:t>
       </w:r>
     </w:p>
     <w:p>
@@ -3236,7 +3785,20 @@
         <w:ind w:firstLine="0"/>
       </w:pPr>
       <w:r>
-        <w:t xml:space="preserve">                STACK_PUSH(num_cells);</w:t>
+        <w:t xml:space="preserve">                STACK_</w:t>
+      </w:r>
+      <w:proofErr w:type="gramStart"/>
+      <w:r>
+        <w:t>PUSH(</w:t>
+      </w:r>
+      <w:proofErr w:type="spellStart"/>
+      <w:proofErr w:type="gramEnd"/>
+      <w:r>
+        <w:t>num_cells</w:t>
+      </w:r>
+      <w:proofErr w:type="spellEnd"/>
+      <w:r>
+        <w:t>);</w:t>
       </w:r>
     </w:p>
     <w:p>
@@ -3245,7 +3807,15 @@
         <w:ind w:firstLine="0"/>
       </w:pPr>
       <w:r>
-        <w:t xml:space="preserve">            } else if (light_change == 2) {</w:t>
+        <w:t xml:space="preserve">            } else if (</w:t>
+      </w:r>
+      <w:proofErr w:type="spellStart"/>
+      <w:r>
+        <w:t>light_change</w:t>
+      </w:r>
+      <w:proofErr w:type="spellEnd"/>
+      <w:r>
+        <w:t xml:space="preserve"> == 2) {</w:t>
       </w:r>
     </w:p>
     <w:p>
@@ -3254,7 +3824,15 @@
         <w:ind w:firstLine="0"/>
       </w:pPr>
       <w:r>
-        <w:t xml:space="preserve">                if (num_stack &gt; 0)</w:t>
+        <w:t xml:space="preserve">                if (</w:t>
+      </w:r>
+      <w:proofErr w:type="spellStart"/>
+      <w:r>
+        <w:t>num_stack</w:t>
+      </w:r>
+      <w:proofErr w:type="spellEnd"/>
+      <w:r>
+        <w:t xml:space="preserve"> &gt; 0)</w:t>
       </w:r>
     </w:p>
     <w:p>
@@ -3317,7 +3895,21 @@
         <w:rPr>
           <w:lang w:val="ru-RU"/>
         </w:rPr>
-        <w:t xml:space="preserve">            break;</w:t>
+        <w:t xml:space="preserve">            </w:t>
+      </w:r>
+      <w:proofErr w:type="spellStart"/>
+      <w:r>
+        <w:rPr>
+          <w:lang w:val="ru-RU"/>
+        </w:rPr>
+        <w:t>break</w:t>
+      </w:r>
+      <w:proofErr w:type="spellEnd"/>
+      <w:r>
+        <w:rPr>
+          <w:lang w:val="ru-RU"/>
+        </w:rPr>
+        <w:t>;</w:t>
       </w:r>
     </w:p>
     <w:p>
@@ -3539,7 +4131,21 @@
         <w:rPr>
           <w:lang w:val="ru-RU"/>
         </w:rPr>
-        <w:t>доказывается через его способность эмулировать машину с двумя счетчиками, которая в свою очередь является тьюринг-полной.</w:t>
+        <w:t xml:space="preserve">доказывается через его способность эмулировать машину с двумя счетчиками, которая в свою очередь является </w:t>
+      </w:r>
+      <w:proofErr w:type="spellStart"/>
+      <w:r>
+        <w:rPr>
+          <w:lang w:val="ru-RU"/>
+        </w:rPr>
+        <w:t>тьюринг</w:t>
+      </w:r>
+      <w:proofErr w:type="spellEnd"/>
+      <w:r>
+        <w:rPr>
+          <w:lang w:val="ru-RU"/>
+        </w:rPr>
+        <w:t>-полной.</w:t>
       </w:r>
     </w:p>
     <w:p>
@@ -4020,8 +4626,39 @@
       <w:pPr>
         <w:pStyle w:val="ae"/>
       </w:pPr>
-      <w:r>
-        <w:t>runBench := func(name, exe, arg string) {</w:t>
+      <w:proofErr w:type="spellStart"/>
+      <w:proofErr w:type="gramStart"/>
+      <w:r>
+        <w:t>runBench</w:t>
+      </w:r>
+      <w:proofErr w:type="spellEnd"/>
+      <w:r>
+        <w:t xml:space="preserve"> :</w:t>
+      </w:r>
+      <w:proofErr w:type="gramEnd"/>
+      <w:r>
+        <w:t xml:space="preserve">= </w:t>
+      </w:r>
+      <w:proofErr w:type="spellStart"/>
+      <w:proofErr w:type="gramStart"/>
+      <w:r>
+        <w:t>func</w:t>
+      </w:r>
+      <w:proofErr w:type="spellEnd"/>
+      <w:r>
+        <w:t>(</w:t>
+      </w:r>
+      <w:proofErr w:type="gramEnd"/>
+      <w:r>
+        <w:t xml:space="preserve">name, exe, </w:t>
+      </w:r>
+      <w:proofErr w:type="spellStart"/>
+      <w:r>
+        <w:t>arg</w:t>
+      </w:r>
+      <w:proofErr w:type="spellEnd"/>
+      <w:r>
+        <w:t xml:space="preserve"> string) {</w:t>
       </w:r>
     </w:p>
     <w:p>
@@ -4029,15 +4666,46 @@
         <w:pStyle w:val="ae"/>
       </w:pPr>
       <w:r>
-        <w:t xml:space="preserve">    var totalDur, totalCPU time.Duration</w:t>
-      </w:r>
+        <w:t xml:space="preserve">    var </w:t>
+      </w:r>
+      <w:proofErr w:type="spellStart"/>
+      <w:r>
+        <w:t>totalDur</w:t>
+      </w:r>
+      <w:proofErr w:type="spellEnd"/>
+      <w:r>
+        <w:t xml:space="preserve">, </w:t>
+      </w:r>
+      <w:proofErr w:type="spellStart"/>
+      <w:r>
+        <w:t>totalCPU</w:t>
+      </w:r>
+      <w:proofErr w:type="spellEnd"/>
+      <w:r>
+        <w:t xml:space="preserve"> </w:t>
+      </w:r>
+      <w:proofErr w:type="spellStart"/>
+      <w:proofErr w:type="gramStart"/>
+      <w:r>
+        <w:t>time.Duration</w:t>
+      </w:r>
+      <w:proofErr w:type="spellEnd"/>
+      <w:proofErr w:type="gramEnd"/>
     </w:p>
     <w:p>
       <w:pPr>
         <w:pStyle w:val="ae"/>
       </w:pPr>
       <w:r>
-        <w:t xml:space="preserve">    var maxMem int64</w:t>
+        <w:t xml:space="preserve">    var </w:t>
+      </w:r>
+      <w:proofErr w:type="spellStart"/>
+      <w:r>
+        <w:t>maxMem</w:t>
+      </w:r>
+      <w:proofErr w:type="spellEnd"/>
+      <w:r>
+        <w:t xml:space="preserve"> int64</w:t>
       </w:r>
     </w:p>
     <w:p>
@@ -4058,7 +4726,36 @@
         <w:pStyle w:val="ae"/>
       </w:pPr>
       <w:r>
-        <w:t xml:space="preserve">    for i := 0; i &lt; 100; i++ {</w:t>
+        <w:t xml:space="preserve">    for </w:t>
+      </w:r>
+      <w:proofErr w:type="spellStart"/>
+      <w:proofErr w:type="gramStart"/>
+      <w:r>
+        <w:t>i</w:t>
+      </w:r>
+      <w:proofErr w:type="spellEnd"/>
+      <w:r>
+        <w:t xml:space="preserve"> :</w:t>
+      </w:r>
+      <w:proofErr w:type="gramEnd"/>
+      <w:r>
+        <w:t xml:space="preserve">= 0; </w:t>
+      </w:r>
+      <w:proofErr w:type="spellStart"/>
+      <w:r>
+        <w:t>i</w:t>
+      </w:r>
+      <w:proofErr w:type="spellEnd"/>
+      <w:r>
+        <w:t xml:space="preserve"> &lt; 100; </w:t>
+      </w:r>
+      <w:proofErr w:type="spellStart"/>
+      <w:r>
+        <w:t>i</w:t>
+      </w:r>
+      <w:proofErr w:type="spellEnd"/>
+      <w:r>
+        <w:t>++ {</w:t>
       </w:r>
     </w:p>
     <w:p>
@@ -4066,7 +4763,53 @@
         <w:pStyle w:val="ae"/>
       </w:pPr>
       <w:r>
-        <w:t xml:space="preserve">        ctx, cancel := context.WithTimeout(context.Background(), 10*time.Second)</w:t>
+        <w:t xml:space="preserve">        </w:t>
+      </w:r>
+      <w:proofErr w:type="spellStart"/>
+      <w:r>
+        <w:t>ctx</w:t>
+      </w:r>
+      <w:proofErr w:type="spellEnd"/>
+      <w:r>
+        <w:t xml:space="preserve">, </w:t>
+      </w:r>
+      <w:proofErr w:type="gramStart"/>
+      <w:r>
+        <w:t>cancel :</w:t>
+      </w:r>
+      <w:proofErr w:type="gramEnd"/>
+      <w:r>
+        <w:t xml:space="preserve">= </w:t>
+      </w:r>
+      <w:proofErr w:type="spellStart"/>
+      <w:proofErr w:type="gramStart"/>
+      <w:r>
+        <w:t>context.WithTimeout</w:t>
+      </w:r>
+      <w:proofErr w:type="spellEnd"/>
+      <w:proofErr w:type="gramEnd"/>
+      <w:r>
+        <w:t>(</w:t>
+      </w:r>
+      <w:proofErr w:type="spellStart"/>
+      <w:proofErr w:type="gramStart"/>
+      <w:r>
+        <w:t>context.Background</w:t>
+      </w:r>
+      <w:proofErr w:type="spellEnd"/>
+      <w:proofErr w:type="gramEnd"/>
+      <w:r>
+        <w:t>(), 10*</w:t>
+      </w:r>
+      <w:proofErr w:type="spellStart"/>
+      <w:proofErr w:type="gramStart"/>
+      <w:r>
+        <w:t>time.Second</w:t>
+      </w:r>
+      <w:proofErr w:type="spellEnd"/>
+      <w:proofErr w:type="gramEnd"/>
+      <w:r>
+        <w:t>)</w:t>
       </w:r>
     </w:p>
     <w:p>
@@ -4074,7 +4817,46 @@
         <w:pStyle w:val="ae"/>
       </w:pPr>
       <w:r>
-        <w:t xml:space="preserve">        cmd := exec.CommandContext(ctx, exe, arg)</w:t>
+        <w:t xml:space="preserve">        </w:t>
+      </w:r>
+      <w:proofErr w:type="spellStart"/>
+      <w:proofErr w:type="gramStart"/>
+      <w:r>
+        <w:t>cmd</w:t>
+      </w:r>
+      <w:proofErr w:type="spellEnd"/>
+      <w:r>
+        <w:t xml:space="preserve"> :</w:t>
+      </w:r>
+      <w:proofErr w:type="gramEnd"/>
+      <w:r>
+        <w:t xml:space="preserve">= </w:t>
+      </w:r>
+      <w:proofErr w:type="spellStart"/>
+      <w:proofErr w:type="gramStart"/>
+      <w:r>
+        <w:t>exec.CommandContext</w:t>
+      </w:r>
+      <w:proofErr w:type="spellEnd"/>
+      <w:proofErr w:type="gramEnd"/>
+      <w:r>
+        <w:t>(</w:t>
+      </w:r>
+      <w:proofErr w:type="spellStart"/>
+      <w:r>
+        <w:t>ctx</w:t>
+      </w:r>
+      <w:proofErr w:type="spellEnd"/>
+      <w:r>
+        <w:t xml:space="preserve">, exe, </w:t>
+      </w:r>
+      <w:proofErr w:type="spellStart"/>
+      <w:r>
+        <w:t>arg</w:t>
+      </w:r>
+      <w:proofErr w:type="spellEnd"/>
+      <w:r>
+        <w:t>)</w:t>
       </w:r>
     </w:p>
     <w:p>
@@ -4090,7 +4872,25 @@
         <w:pStyle w:val="ae"/>
       </w:pPr>
       <w:r>
-        <w:t xml:space="preserve">        start := time.Now()</w:t>
+        <w:t xml:space="preserve">        </w:t>
+      </w:r>
+      <w:proofErr w:type="gramStart"/>
+      <w:r>
+        <w:t>start :</w:t>
+      </w:r>
+      <w:proofErr w:type="gramEnd"/>
+      <w:r>
+        <w:t xml:space="preserve">= </w:t>
+      </w:r>
+      <w:proofErr w:type="spellStart"/>
+      <w:proofErr w:type="gramStart"/>
+      <w:r>
+        <w:t>time.Now</w:t>
+      </w:r>
+      <w:proofErr w:type="spellEnd"/>
+      <w:proofErr w:type="gramEnd"/>
+      <w:r>
+        <w:t>()</w:t>
       </w:r>
     </w:p>
     <w:p>
@@ -4098,7 +4898,25 @@
         <w:pStyle w:val="ae"/>
       </w:pPr>
       <w:r>
-        <w:t xml:space="preserve">        err := cmd.Run()</w:t>
+        <w:t xml:space="preserve">        </w:t>
+      </w:r>
+      <w:proofErr w:type="gramStart"/>
+      <w:r>
+        <w:t>err :</w:t>
+      </w:r>
+      <w:proofErr w:type="gramEnd"/>
+      <w:r>
+        <w:t xml:space="preserve">= </w:t>
+      </w:r>
+      <w:proofErr w:type="spellStart"/>
+      <w:proofErr w:type="gramStart"/>
+      <w:r>
+        <w:t>cmd.Run</w:t>
+      </w:r>
+      <w:proofErr w:type="spellEnd"/>
+      <w:proofErr w:type="gramEnd"/>
+      <w:r>
+        <w:t>()</w:t>
       </w:r>
     </w:p>
     <w:p>
@@ -4106,7 +4924,25 @@
         <w:pStyle w:val="ae"/>
       </w:pPr>
       <w:r>
-        <w:t xml:space="preserve">        elapsed := time.Since(start)</w:t>
+        <w:t xml:space="preserve">        </w:t>
+      </w:r>
+      <w:proofErr w:type="gramStart"/>
+      <w:r>
+        <w:t>elapsed :</w:t>
+      </w:r>
+      <w:proofErr w:type="gramEnd"/>
+      <w:r>
+        <w:t xml:space="preserve">= </w:t>
+      </w:r>
+      <w:proofErr w:type="spellStart"/>
+      <w:proofErr w:type="gramStart"/>
+      <w:r>
+        <w:t>time.Since</w:t>
+      </w:r>
+      <w:proofErr w:type="spellEnd"/>
+      <w:proofErr w:type="gramEnd"/>
+      <w:r>
+        <w:t>(start)</w:t>
       </w:r>
     </w:p>
     <w:p>
@@ -4114,7 +4950,15 @@
         <w:pStyle w:val="ae"/>
       </w:pPr>
       <w:r>
-        <w:t xml:space="preserve">        cancel()</w:t>
+        <w:t xml:space="preserve">        </w:t>
+      </w:r>
+      <w:proofErr w:type="gramStart"/>
+      <w:r>
+        <w:t>cancel(</w:t>
+      </w:r>
+      <w:proofErr w:type="gramEnd"/>
+      <w:r>
+        <w:t>)</w:t>
       </w:r>
     </w:p>
     <w:p>
@@ -4127,7 +4971,15 @@
         <w:pStyle w:val="ae"/>
       </w:pPr>
       <w:r>
-        <w:t xml:space="preserve">        if err != nil {</w:t>
+        <w:t xml:space="preserve">        if </w:t>
+      </w:r>
+      <w:proofErr w:type="gramStart"/>
+      <w:r>
+        <w:t>err !</w:t>
+      </w:r>
+      <w:proofErr w:type="gramEnd"/>
+      <w:r>
+        <w:t>= nil {</w:t>
       </w:r>
     </w:p>
     <w:p>
@@ -4151,15 +5003,38 @@
         <w:pStyle w:val="ae"/>
       </w:pPr>
       <w:r>
-        <w:t xml:space="preserve">        state := cmd.ProcessState</w:t>
-      </w:r>
+        <w:t xml:space="preserve">        </w:t>
+      </w:r>
+      <w:proofErr w:type="gramStart"/>
+      <w:r>
+        <w:t>state :</w:t>
+      </w:r>
+      <w:proofErr w:type="gramEnd"/>
+      <w:r>
+        <w:t xml:space="preserve">= </w:t>
+      </w:r>
+      <w:proofErr w:type="spellStart"/>
+      <w:proofErr w:type="gramStart"/>
+      <w:r>
+        <w:t>cmd.ProcessState</w:t>
+      </w:r>
+      <w:proofErr w:type="spellEnd"/>
+      <w:proofErr w:type="gramEnd"/>
     </w:p>
     <w:p>
       <w:pPr>
         <w:pStyle w:val="ae"/>
       </w:pPr>
       <w:r>
-        <w:t xml:space="preserve">        totalDur += elapsed</w:t>
+        <w:t xml:space="preserve">        </w:t>
+      </w:r>
+      <w:proofErr w:type="spellStart"/>
+      <w:r>
+        <w:t>totalDur</w:t>
+      </w:r>
+      <w:proofErr w:type="spellEnd"/>
+      <w:r>
+        <w:t xml:space="preserve"> += elapsed</w:t>
       </w:r>
     </w:p>
     <w:p>
@@ -4167,7 +5042,35 @@
         <w:pStyle w:val="ae"/>
       </w:pPr>
       <w:r>
-        <w:t xml:space="preserve">        totalCPU += state.UserTime() + state.SystemTime()</w:t>
+        <w:t xml:space="preserve">        </w:t>
+      </w:r>
+      <w:proofErr w:type="spellStart"/>
+      <w:r>
+        <w:t>totalCPU</w:t>
+      </w:r>
+      <w:proofErr w:type="spellEnd"/>
+      <w:r>
+        <w:t xml:space="preserve"> += </w:t>
+      </w:r>
+      <w:proofErr w:type="spellStart"/>
+      <w:proofErr w:type="gramStart"/>
+      <w:r>
+        <w:t>state.UserTime</w:t>
+      </w:r>
+      <w:proofErr w:type="spellEnd"/>
+      <w:proofErr w:type="gramEnd"/>
+      <w:r>
+        <w:t xml:space="preserve">() + </w:t>
+      </w:r>
+      <w:proofErr w:type="spellStart"/>
+      <w:proofErr w:type="gramStart"/>
+      <w:r>
+        <w:t>state.SystemTime</w:t>
+      </w:r>
+      <w:proofErr w:type="spellEnd"/>
+      <w:proofErr w:type="gramEnd"/>
+      <w:r>
+        <w:t>()</w:t>
       </w:r>
     </w:p>
     <w:p>
@@ -4183,7 +5086,39 @@
         <w:pStyle w:val="ae"/>
       </w:pPr>
       <w:r>
-        <w:t xml:space="preserve">        if mem := getMaxMemory(cmd); mem &gt; maxMem {</w:t>
+        <w:t xml:space="preserve">        if </w:t>
+      </w:r>
+      <w:proofErr w:type="gramStart"/>
+      <w:r>
+        <w:t>mem :</w:t>
+      </w:r>
+      <w:proofErr w:type="gramEnd"/>
+      <w:r>
+        <w:t xml:space="preserve">= </w:t>
+      </w:r>
+      <w:proofErr w:type="spellStart"/>
+      <w:r>
+        <w:t>getMaxMemory</w:t>
+      </w:r>
+      <w:proofErr w:type="spellEnd"/>
+      <w:r>
+        <w:t>(</w:t>
+      </w:r>
+      <w:proofErr w:type="spellStart"/>
+      <w:r>
+        <w:t>cmd</w:t>
+      </w:r>
+      <w:proofErr w:type="spellEnd"/>
+      <w:r>
+        <w:t xml:space="preserve">); mem &gt; </w:t>
+      </w:r>
+      <w:proofErr w:type="spellStart"/>
+      <w:r>
+        <w:t>maxMem</w:t>
+      </w:r>
+      <w:proofErr w:type="spellEnd"/>
+      <w:r>
+        <w:t xml:space="preserve"> {</w:t>
       </w:r>
     </w:p>
     <w:p>
@@ -4196,12 +5131,28 @@
       <w:r>
         <w:t xml:space="preserve">            </w:t>
       </w:r>
-      <w:r>
-        <w:rPr>
-          <w:lang w:val="ru-RU"/>
-        </w:rPr>
-        <w:t>maxMem = mem</w:t>
-      </w:r>
+      <w:proofErr w:type="spellStart"/>
+      <w:r>
+        <w:rPr>
+          <w:lang w:val="ru-RU"/>
+        </w:rPr>
+        <w:t>maxMem</w:t>
+      </w:r>
+      <w:proofErr w:type="spellEnd"/>
+      <w:r>
+        <w:rPr>
+          <w:lang w:val="ru-RU"/>
+        </w:rPr>
+        <w:t xml:space="preserve"> = </w:t>
+      </w:r>
+      <w:proofErr w:type="spellStart"/>
+      <w:r>
+        <w:rPr>
+          <w:lang w:val="ru-RU"/>
+        </w:rPr>
+        <w:t>mem</w:t>
+      </w:r>
+      <w:proofErr w:type="spellEnd"/>
     </w:p>
     <w:p>
       <w:pPr>
@@ -6134,7 +7085,21 @@
         <w:rPr>
           <w:lang w:val="ru-RU"/>
         </w:rPr>
-        <w:t xml:space="preserve">связанных коделей с маркировкой посещенных ячеек, </w:t>
+        <w:t xml:space="preserve">связанных </w:t>
+      </w:r>
+      <w:proofErr w:type="spellStart"/>
+      <w:r>
+        <w:rPr>
+          <w:lang w:val="ru-RU"/>
+        </w:rPr>
+        <w:t>коделей</w:t>
+      </w:r>
+      <w:proofErr w:type="spellEnd"/>
+      <w:r>
+        <w:rPr>
+          <w:lang w:val="ru-RU"/>
+        </w:rPr>
+        <w:t xml:space="preserve"> с маркировкой посещенных ячеек, </w:t>
       </w:r>
       <w:r>
         <w:rPr>
@@ -6409,12 +7374,21 @@
       <w:r>
         <w:t>T</w:t>
       </w:r>
+      <w:proofErr w:type="spellStart"/>
       <w:r>
         <w:rPr>
           <w:vertAlign w:val="subscript"/>
           <w:lang w:val="ru-RU"/>
         </w:rPr>
-        <w:t xml:space="preserve">проц </w:t>
+        <w:t>проц</w:t>
+      </w:r>
+      <w:proofErr w:type="spellEnd"/>
+      <w:r>
+        <w:rPr>
+          <w:vertAlign w:val="subscript"/>
+          <w:lang w:val="ru-RU"/>
+        </w:rPr>
+        <w:t xml:space="preserve"> </w:t>
       </w:r>
       <w:r>
         <w:rPr>
@@ -7090,9 +8064,11 @@
         </w:rPr>
         <w:t xml:space="preserve">время выполнения в </w:t>
       </w:r>
+      <w:proofErr w:type="spellStart"/>
       <w:r>
         <w:t>i</w:t>
       </w:r>
+      <w:proofErr w:type="spellEnd"/>
       <w:r>
         <w:rPr>
           <w:lang w:val="ru-RU"/>

</xml_diff>